<commit_message>
Add file extension tokens {E}, {e}, {ea}; About text names folder and file naming
{E} upper case, {e} lower case, {ea} as it is, all without the dot. They give the
extension of the saved file (.jpe renamed to .jpg, .lrprev saved as .jpg).
Token help, Download Path tab, manual, README, website and launch materials updated.

Co-Authored-By: Claude Opus 5.5 <noreply@anthropic.com>
</commit_message>
<xml_diff>
--- a/docs/Photo_Downloader_Launch_Materials.docx
+++ b/docs/Photo_Downloader_Launch_Materials.docx
@@ -88,7 +88,7 @@
         <w:t xml:space="preserve">Advanced Token-Based Renaming: </w:t>
       </w:r>
       <w:r>
-        <w:t>Dynamically rename files using a highly customizable token engine based on precise EXIF temporal data, camera models, and sequential counters.</w:t>
+        <w:t>Dynamically rename files using a highly customizable token engine based on precise EXIF temporal data, camera models, file extensions, and sequential counters; the same tokens build both the folder structure and the file names.</w:t>
       </w:r>
     </w:p>
     <w:p>
@@ -345,7 +345,7 @@
         <w:t xml:space="preserve">Advanced Token Renaming: </w:t>
       </w:r>
       <w:r>
-        <w:t>Uses dynamic metadata tokens to reconstruct file names on the fly based on shot time, camera body mapping, job codes, and sequence counters.</w:t>
+        <w:t>Uses dynamic metadata tokens to reconstruct file names on the fly based on shot time, camera body mapping, job codes, file extensions, and sequence counters, for folder and file names alike.</w:t>
       </w:r>
     </w:p>
     <w:p>

</xml_diff>

<commit_message>
Bundle 0.1.2.1: version, release notes, documents
- PhotoDownloader.lpi: revision 2, build 1 (0.1.2.1).
- Release notes 0.1.2.1 (md, docx, odt); spec header and history row; User
  Manual 0.1.2; launch materials (txt and both docx) 0.1.2; Git Instructions;
  continuation prompt (and Claude Prompt/Claude-Prompt-0.1.2.1.txt).
- make_formats.py also makes the release notes in three formats.

Co-Authored-By: Claude Opus 5.5 <noreply@anthropic.com>
</commit_message>
<xml_diff>
--- a/docs/Photo_Downloader_Launch_Materials.docx
+++ b/docs/Photo_Downloader_Launch_Materials.docx
@@ -23,7 +23,7 @@
         <w:rPr>
           <w:b/>
         </w:rPr>
-        <w:t>Photo Downloader v0.1.1.1-alpha</w:t>
+        <w:t>Photo Downloader v0.1.2-alpha</w:t>
       </w:r>
     </w:p>
     <w:p>
@@ -46,7 +46,7 @@
         <w:pStyle w:val="Heading2"/>
       </w:pPr>
       <w:r>
-        <w:t>Key Features (Available in version 0.1.1.1)</w:t>
+        <w:t>Key Features (Available in version 0.1.2)</w:t>
       </w:r>
     </w:p>
     <w:p>
@@ -312,12 +312,12 @@
     </w:p>
     <w:p>
       <w:r>
-        <w:t>It is currently in Alpha (version 0.1.1.1), and I’m looking for photographers shooting various camera systems to put the file-parsing engine through its paces.</w:t>
+        <w:t>It is currently in Alpha (version 0.1.2), and I’m looking for photographers shooting various camera systems to put the file-parsing engine through its paces.</w:t>
       </w:r>
     </w:p>
     <w:p>
       <w:r>
-        <w:t>What it does right now (version 0.1.1.1):</w:t>
+        <w:t>What it does right now (version 0.1.2):</w:t>
       </w:r>
     </w:p>
     <w:p>
@@ -488,7 +488,7 @@
         <w:rPr>
           <w:i/>
         </w:rPr>
-        <w:t>"I’m currently running an alpha test for Photo Downloader, a native, open-source desktop app built in Lazarus and Free Pascal that serves as a lightweight, free alternative to paid, subscription-based ingest software. Designed specifically for high-volume photographers, it bypasses heavy modern app frameworks to offer instant, local execution. version 0.1.1.1 automatically scans card readers, detects duplicates by comparing file size and camera signatures, handles token-based metadata renaming, and automatically generates XMP sidecars. It’s completely free, licensed under the GNU GPL v3, and I'm actively looking for alpha testers to help stress-test our native RAW preview and metadata engine."</w:t>
+        <w:t>"I’m currently running an alpha test for Photo Downloader, a native, open-source desktop app built in Lazarus and Free Pascal that serves as a lightweight, free alternative to paid, subscription-based ingest software. Designed specifically for high-volume photographers, it bypasses heavy modern app frameworks to offer instant, local execution. version 0.1.2 automatically scans card readers, detects duplicates by comparing file size and camera signatures, handles token-based metadata renaming, and automatically generates XMP sidecars. It’s completely free, licensed under the GNU GPL v3, and I'm actively looking for alpha testers to help stress-test our native RAW preview and metadata engine."</w:t>
       </w:r>
     </w:p>
     <w:sectPr>

</xml_diff>

<commit_message>
Bundle 0.1.3.1: version, release notes, documents
- PhotoDownloader.lpi: revision 3, build 1 (0.1.3.1).
- Release notes 0.1.3.1 (md, docx, odt); spec header and history row; User Manual 0.1.3; launch materials (txt and both docx) 0.1.3; Git Instructions; continuation prompt (and Claude Prompt/Claude-Prompt-0.1.3.1.txt).
- make_formats.py also makes the 0.1.3.1 release notes.

Co-Authored-By: Claude Opus 5.5 <noreply@anthropic.com>
</commit_message>
<xml_diff>
--- a/docs/Photo_Downloader_Launch_Materials.docx
+++ b/docs/Photo_Downloader_Launch_Materials.docx
@@ -23,7 +23,7 @@
         <w:rPr>
           <w:b/>
         </w:rPr>
-        <w:t>Photo Downloader v0.1.2-alpha</w:t>
+        <w:t>Photo Downloader v0.1.3-alpha</w:t>
       </w:r>
     </w:p>
     <w:p>
@@ -46,7 +46,7 @@
         <w:pStyle w:val="Heading2"/>
       </w:pPr>
       <w:r>
-        <w:t>Key Features (Available in version 0.1.2)</w:t>
+        <w:t>Key Features (Available in version 0.1.3)</w:t>
       </w:r>
     </w:p>
     <w:p>
@@ -312,12 +312,12 @@
     </w:p>
     <w:p>
       <w:r>
-        <w:t>It is currently in Alpha (version 0.1.2), and I’m looking for photographers shooting various camera systems to put the file-parsing engine through its paces.</w:t>
+        <w:t>It is currently in Alpha (version 0.1.3), and I’m looking for photographers shooting various camera systems to put the file-parsing engine through its paces.</w:t>
       </w:r>
     </w:p>
     <w:p>
       <w:r>
-        <w:t>What it does right now (version 0.1.2):</w:t>
+        <w:t>What it does right now (version 0.1.3):</w:t>
       </w:r>
     </w:p>
     <w:p>
@@ -488,7 +488,7 @@
         <w:rPr>
           <w:i/>
         </w:rPr>
-        <w:t>"I’m currently running an alpha test for Photo Downloader, a native, open-source desktop app built in Lazarus and Free Pascal that serves as a lightweight, free alternative to paid, subscription-based ingest software. Designed specifically for high-volume photographers, it bypasses heavy modern app frameworks to offer instant, local execution. version 0.1.2 automatically scans card readers, detects duplicates by comparing file size and camera signatures, handles token-based metadata renaming, and automatically generates XMP sidecars. It’s completely free, licensed under the GNU GPL v3, and I'm actively looking for alpha testers to help stress-test our native RAW preview and metadata engine."</w:t>
+        <w:t>"I’m currently running an alpha test for Photo Downloader, a native, open-source desktop app built in Lazarus and Free Pascal that serves as a lightweight, free alternative to paid, subscription-based ingest software. Designed specifically for high-volume photographers, it bypasses heavy modern app frameworks to offer instant, local execution. version 0.1.3 automatically scans card readers, detects duplicates by comparing file size and camera signatures, handles token-based metadata renaming, and automatically generates XMP sidecars. It’s completely free, licensed under the GNU GPL v3, and I'm actively looking for alpha testers to help stress-test our native RAW preview and metadata engine."</w:t>
       </w:r>
     </w:p>
     <w:sectPr>

</xml_diff>

<commit_message>
Bundle 0.1.4.1: version, release notes, documents
- PhotoDownloader.lpi: revision 4 (built 0.1.4.1; lazbuild left build 2 for the next compile).
- Release notes 0.1.4.1 (md, docx, odt); spec header and history row; User Manual 0.1.4; launch materials (txt and both docx) 0.1.4; Git Instructions; continuation prompt (and Claude Prompt/Claude-Prompt-0.1.4.1.txt).
- make_formats.py also makes the 0.1.4.1 release notes. The 0.1.3.1 bundle zip moved to Archive/.

Co-Authored-By: Claude Opus 5.5 <noreply@anthropic.com>
</commit_message>
<xml_diff>
--- a/docs/Photo_Downloader_Launch_Materials.docx
+++ b/docs/Photo_Downloader_Launch_Materials.docx
@@ -23,7 +23,7 @@
         <w:rPr>
           <w:b/>
         </w:rPr>
-        <w:t>Photo Downloader v0.1.3-alpha</w:t>
+        <w:t>Photo Downloader v0.1.4-alpha</w:t>
       </w:r>
     </w:p>
     <w:p>
@@ -46,7 +46,7 @@
         <w:pStyle w:val="Heading2"/>
       </w:pPr>
       <w:r>
-        <w:t>Key Features (Available in version 0.1.3)</w:t>
+        <w:t>Key Features (Available in version 0.1.4)</w:t>
       </w:r>
     </w:p>
     <w:p>
@@ -312,12 +312,12 @@
     </w:p>
     <w:p>
       <w:r>
-        <w:t>It is currently in Alpha (version 0.1.3), and I’m looking for photographers shooting various camera systems to put the file-parsing engine through its paces.</w:t>
+        <w:t>It is currently in Alpha (version 0.1.4), and I’m looking for photographers shooting various camera systems to put the file-parsing engine through its paces.</w:t>
       </w:r>
     </w:p>
     <w:p>
       <w:r>
-        <w:t>What it does right now (version 0.1.3):</w:t>
+        <w:t>What it does right now (version 0.1.4):</w:t>
       </w:r>
     </w:p>
     <w:p>
@@ -488,7 +488,7 @@
         <w:rPr>
           <w:i/>
         </w:rPr>
-        <w:t>"I’m currently running an alpha test for Photo Downloader, a native, open-source desktop app built in Lazarus and Free Pascal that serves as a lightweight, free alternative to paid, subscription-based ingest software. Designed specifically for high-volume photographers, it bypasses heavy modern app frameworks to offer instant, local execution. version 0.1.3 automatically scans card readers, detects duplicates by comparing file size and camera signatures, handles token-based metadata renaming, and automatically generates XMP sidecars. It’s completely free, licensed under the GNU GPL v3, and I'm actively looking for alpha testers to help stress-test our native RAW preview and metadata engine."</w:t>
+        <w:t>"I’m currently running an alpha test for Photo Downloader, a native, open-source desktop app built in Lazarus and Free Pascal that serves as a lightweight, free alternative to paid, subscription-based ingest software. Designed specifically for high-volume photographers, it bypasses heavy modern app frameworks to offer instant, local execution. version 0.1.4 automatically scans card readers, detects duplicates by comparing file size and camera signatures, handles token-based metadata renaming, and automatically generates XMP sidecars. It’s completely free, licensed under the GNU GPL v3, and I'm actively looking for alpha testers to help stress-test our native RAW preview and metadata engine."</w:t>
       </w:r>
     </w:p>
     <w:sectPr>

</xml_diff>